<commit_message>
Recover lost files from previous commit c0efef3
</commit_message>
<xml_diff>
--- a/2022310020.docx
+++ b/2022310020.docx
@@ -1686,6 +1686,7 @@
     <w:p>
       <w:pPr>
         <w:pStyle w:val="TOC1"/>
+        <w:ind w:firstLineChars="0" w:firstLine="0"/>
       </w:pPr>
       <w:r>
         <w:rPr>
@@ -1721,25 +1722,16 @@
     <w:p>
       <w:pPr>
         <w:pStyle w:val="TOC1"/>
-        <w:ind w:firstLineChars="200" w:firstLine="480"/>
-        <w:rPr>
-          <w:b w:val="0"/>
-          <w:bCs w:val="0"/>
-        </w:rPr>
-      </w:pPr>
-      <w:r>
-        <w:rPr>
-          <w:rFonts w:hint="eastAsia"/>
-          <w:b w:val="0"/>
-          <w:bCs w:val="0"/>
+      </w:pPr>
+      <w:r>
+        <w:rPr>
+          <w:rFonts w:hint="eastAsia"/>
         </w:rPr>
         <w:t xml:space="preserve">1.1 </w:t>
       </w:r>
       <w:r>
         <w:rPr>
           <w:rFonts w:hint="eastAsia"/>
-          <w:b w:val="0"/>
-          <w:bCs w:val="0"/>
         </w:rPr>
         <w:t>研究背景</w:t>
       </w:r>
@@ -1747,25 +1739,16 @@
     <w:p>
       <w:pPr>
         <w:pStyle w:val="TOC1"/>
-        <w:ind w:firstLineChars="200" w:firstLine="480"/>
-        <w:rPr>
-          <w:b w:val="0"/>
-          <w:bCs w:val="0"/>
-        </w:rPr>
-      </w:pPr>
-      <w:r>
-        <w:rPr>
-          <w:rFonts w:hint="eastAsia"/>
-          <w:b w:val="0"/>
-          <w:bCs w:val="0"/>
+      </w:pPr>
+      <w:r>
+        <w:rPr>
+          <w:rFonts w:hint="eastAsia"/>
         </w:rPr>
         <w:t xml:space="preserve">1.2 </w:t>
       </w:r>
       <w:r>
         <w:rPr>
           <w:rFonts w:hint="eastAsia"/>
-          <w:b w:val="0"/>
-          <w:bCs w:val="0"/>
         </w:rPr>
         <w:t>研究目的与研究意义</w:t>
       </w:r>
@@ -1773,90 +1756,82 @@
     <w:p>
       <w:pPr>
         <w:pStyle w:val="TOC1"/>
-        <w:rPr>
-          <w:b w:val="0"/>
-          <w:bCs w:val="0"/>
-        </w:rPr>
-      </w:pPr>
-      <w:r>
-        <w:rPr>
-          <w:rFonts w:hint="eastAsia"/>
-          <w:b w:val="0"/>
-          <w:bCs w:val="0"/>
-        </w:rPr>
-        <w:t xml:space="preserve">    </w:t>
-      </w:r>
-      <w:r>
-        <w:rPr>
-          <w:rFonts w:hint="eastAsia"/>
-          <w:b w:val="0"/>
-          <w:bCs w:val="0"/>
+      </w:pPr>
+      <w:r>
+        <w:rPr>
+          <w:rFonts w:hint="eastAsia"/>
         </w:rPr>
         <w:t>1.</w:t>
       </w:r>
       <w:r>
         <w:rPr>
           <w:rFonts w:hint="eastAsia"/>
-          <w:b w:val="0"/>
-          <w:bCs w:val="0"/>
         </w:rPr>
         <w:t>3</w:t>
       </w:r>
       <w:r>
         <w:rPr>
           <w:rFonts w:hint="eastAsia"/>
-          <w:b w:val="0"/>
-          <w:bCs w:val="0"/>
         </w:rPr>
         <w:t xml:space="preserve"> </w:t>
       </w:r>
       <w:r>
         <w:rPr>
           <w:rFonts w:hint="eastAsia"/>
-          <w:b w:val="0"/>
-          <w:bCs w:val="0"/>
         </w:rPr>
         <w:t>研究内容与研究框架</w:t>
       </w:r>
     </w:p>
     <w:p>
       <w:pPr>
+        <w:ind w:leftChars="350" w:left="840" w:firstLineChars="0" w:firstLine="0"/>
+      </w:pPr>
+      <w:r>
+        <w:t xml:space="preserve">1.3.1 </w:t>
+      </w:r>
+      <w:r>
+        <w:t>研究内容</w:t>
+      </w:r>
+      <w:r>
+        <w:br/>
+        <w:t xml:space="preserve">1.3.2 </w:t>
+      </w:r>
+      <w:r>
+        <w:t>研究方法</w:t>
+      </w:r>
+      <w:r>
+        <w:br/>
+        <w:t xml:space="preserve">1.3.3 </w:t>
+      </w:r>
+      <w:r>
+        <w:t>研究思路与技术路线</w:t>
+      </w:r>
+    </w:p>
+    <w:p>
+      <w:pPr>
         <w:pStyle w:val="TOC1"/>
-        <w:ind w:firstLineChars="200" w:firstLine="480"/>
-        <w:rPr>
-          <w:b w:val="0"/>
-          <w:bCs w:val="0"/>
-        </w:rPr>
-      </w:pPr>
-      <w:r>
-        <w:rPr>
-          <w:rFonts w:hint="eastAsia"/>
-          <w:b w:val="0"/>
-          <w:bCs w:val="0"/>
+      </w:pPr>
+      <w:r>
+        <w:rPr>
+          <w:rFonts w:hint="eastAsia"/>
         </w:rPr>
         <w:t>1</w:t>
       </w:r>
       <w:r>
         <w:rPr>
           <w:rFonts w:hint="eastAsia"/>
-          <w:b w:val="0"/>
-          <w:bCs w:val="0"/>
         </w:rPr>
         <w:t>.4</w:t>
       </w:r>
       <w:r>
         <w:rPr>
           <w:rFonts w:hint="eastAsia"/>
-          <w:b w:val="0"/>
-          <w:bCs w:val="0"/>
         </w:rPr>
         <w:t xml:space="preserve"> </w:t>
       </w:r>
       <w:r>
         <w:rPr>
           <w:rFonts w:hint="eastAsia"/>
-          <w:b w:val="0"/>
-          <w:bCs w:val="0"/>
         </w:rPr>
         <w:t>研究创新点</w:t>
       </w:r>
@@ -1907,17 +1882,25 @@
     </w:p>
     <w:p>
       <w:pPr>
-        <w:ind w:firstLine="480"/>
-      </w:pPr>
-      <w:r>
-        <w:rPr>
-          <w:rFonts w:hint="eastAsia"/>
+        <w:ind w:firstLine="482"/>
+        <w:rPr>
+          <w:b/>
+          <w:bCs/>
+        </w:rPr>
+      </w:pPr>
+      <w:r>
+        <w:rPr>
+          <w:rFonts w:hint="eastAsia"/>
+          <w:b/>
+          <w:bCs/>
         </w:rPr>
         <w:t xml:space="preserve">2.1 </w:t>
       </w:r>
       <w:r>
         <w:rPr>
           <w:rFonts w:hint="eastAsia"/>
+          <w:b/>
+          <w:bCs/>
         </w:rPr>
         <w:t>数据要素与企业生产率研究综述</w:t>
       </w:r>
@@ -1987,17 +1970,25 @@
     </w:p>
     <w:p>
       <w:pPr>
-        <w:ind w:firstLine="480"/>
-      </w:pPr>
-      <w:r>
-        <w:rPr>
-          <w:rFonts w:hint="eastAsia"/>
+        <w:ind w:firstLine="482"/>
+        <w:rPr>
+          <w:b/>
+          <w:bCs/>
+        </w:rPr>
+      </w:pPr>
+      <w:r>
+        <w:rPr>
+          <w:rFonts w:hint="eastAsia"/>
+          <w:b/>
+          <w:bCs/>
         </w:rPr>
         <w:t xml:space="preserve">2.2 </w:t>
       </w:r>
       <w:r>
         <w:rPr>
           <w:rFonts w:hint="eastAsia"/>
+          <w:b/>
+          <w:bCs/>
         </w:rPr>
         <w:t>企业全要素生产率测度研究</w:t>
       </w:r>
@@ -2055,17 +2046,25 @@
     </w:p>
     <w:p>
       <w:pPr>
-        <w:ind w:firstLine="480"/>
-      </w:pPr>
-      <w:r>
-        <w:rPr>
-          <w:rFonts w:hint="eastAsia"/>
+        <w:ind w:firstLine="482"/>
+        <w:rPr>
+          <w:b/>
+          <w:bCs/>
+        </w:rPr>
+      </w:pPr>
+      <w:r>
+        <w:rPr>
+          <w:rFonts w:hint="eastAsia"/>
+          <w:b/>
+          <w:bCs/>
         </w:rPr>
         <w:t xml:space="preserve">2.3 </w:t>
       </w:r>
       <w:r>
         <w:rPr>
           <w:rFonts w:hint="eastAsia"/>
+          <w:b/>
+          <w:bCs/>
         </w:rPr>
         <w:t>异质性因果效应识别方法研究</w:t>
       </w:r>
@@ -2147,17 +2146,25 @@
     </w:p>
     <w:p>
       <w:pPr>
-        <w:ind w:firstLine="480"/>
-      </w:pPr>
-      <w:r>
-        <w:rPr>
-          <w:rFonts w:hint="eastAsia"/>
+        <w:ind w:firstLine="482"/>
+        <w:rPr>
+          <w:b/>
+          <w:bCs/>
+        </w:rPr>
+      </w:pPr>
+      <w:r>
+        <w:rPr>
+          <w:rFonts w:hint="eastAsia"/>
+          <w:b/>
+          <w:bCs/>
         </w:rPr>
         <w:t xml:space="preserve">2.4 </w:t>
       </w:r>
       <w:r>
         <w:rPr>
           <w:rFonts w:hint="eastAsia"/>
+          <w:b/>
+          <w:bCs/>
         </w:rPr>
         <w:t>文献评述与研究切入点</w:t>
       </w:r>
@@ -2301,6 +2308,12 @@
         <w:t xml:space="preserve">    </w:t>
       </w:r>
       <w:r>
+        <w:rPr>
+          <w:rFonts w:hint="eastAsia"/>
+        </w:rPr>
+        <w:t xml:space="preserve"> 3.2.1</w:t>
+      </w:r>
+      <w:r>
         <w:t>资源配置效率机制</w:t>
       </w:r>
     </w:p>
@@ -2315,6 +2328,12 @@
         <w:t xml:space="preserve">    </w:t>
       </w:r>
       <w:r>
+        <w:rPr>
+          <w:rFonts w:hint="eastAsia"/>
+        </w:rPr>
+        <w:t xml:space="preserve"> 3.2.2</w:t>
+      </w:r>
+      <w:r>
         <w:t>技术创新机制</w:t>
       </w:r>
     </w:p>
@@ -2335,6 +2354,12 @@
         <w:t xml:space="preserve">  </w:t>
       </w:r>
       <w:r>
+        <w:rPr>
+          <w:rFonts w:hint="eastAsia"/>
+        </w:rPr>
+        <w:t xml:space="preserve"> 3.2.3</w:t>
+      </w:r>
+      <w:r>
         <w:t>组织管理效率机制</w:t>
       </w:r>
     </w:p>
@@ -2346,6 +2371,7 @@
         <w:rPr>
           <w:rFonts w:hint="eastAsia"/>
         </w:rPr>
+        <w:lastRenderedPageBreak/>
         <w:t xml:space="preserve">  </w:t>
       </w:r>
       <w:r>
@@ -2355,6 +2381,12 @@
         <w:t xml:space="preserve">  </w:t>
       </w:r>
       <w:r>
+        <w:rPr>
+          <w:rFonts w:hint="eastAsia"/>
+        </w:rPr>
+        <w:t xml:space="preserve"> 3.2.4</w:t>
+      </w:r>
+      <w:r>
         <w:t>市场匹配与需求预测机制</w:t>
       </w:r>
     </w:p>
@@ -2393,9 +2425,6 @@
       </w:r>
       <w:r>
         <w:br/>
-      </w:r>
-      <w:r>
-        <w:lastRenderedPageBreak/>
         <w:t xml:space="preserve">3.3.2 </w:t>
       </w:r>
       <w:r>
@@ -2441,6 +2470,144 @@
     </w:p>
     <w:p>
       <w:pPr>
+        <w:ind w:firstLine="482"/>
+        <w:rPr>
+          <w:b/>
+          <w:bCs/>
+        </w:rPr>
+      </w:pPr>
+      <w:r>
+        <w:rPr>
+          <w:b/>
+          <w:bCs/>
+        </w:rPr>
+        <w:t xml:space="preserve">3.5 </w:t>
+      </w:r>
+      <w:r>
+        <w:rPr>
+          <w:b/>
+          <w:bCs/>
+        </w:rPr>
+        <w:t>双重机器学习（</w:t>
+      </w:r>
+      <w:r>
+        <w:rPr>
+          <w:b/>
+          <w:bCs/>
+        </w:rPr>
+        <w:t>DML</w:t>
+      </w:r>
+      <w:r>
+        <w:rPr>
+          <w:b/>
+          <w:bCs/>
+        </w:rPr>
+        <w:t>）与平均效应识别的理论衔接</w:t>
+      </w:r>
+    </w:p>
+    <w:p>
+      <w:pPr>
+        <w:ind w:left="898" w:firstLineChars="0" w:firstLine="0"/>
+      </w:pPr>
+      <w:r>
+        <w:t xml:space="preserve">3.5.1 </w:t>
+      </w:r>
+      <w:r>
+        <w:t>正交化与去偏思想</w:t>
+      </w:r>
+      <w:r>
+        <w:br/>
+        <w:t xml:space="preserve">3.5.2 </w:t>
+      </w:r>
+      <w:r>
+        <w:t>交叉拟合与稳健推断</w:t>
+      </w:r>
+      <w:r>
+        <w:br/>
+        <w:t>3.5.3 DML</w:t>
+      </w:r>
+      <w:r>
+        <w:t>与本文平均效应识别的关系</w:t>
+      </w:r>
+    </w:p>
+    <w:p>
+      <w:pPr>
+        <w:ind w:firstLineChars="0" w:firstLine="420"/>
+        <w:rPr>
+          <w:b/>
+          <w:bCs/>
+        </w:rPr>
+      </w:pPr>
+      <w:r>
+        <w:rPr>
+          <w:rFonts w:hint="eastAsia"/>
+          <w:b/>
+          <w:bCs/>
+        </w:rPr>
+        <w:t xml:space="preserve">3.6 </w:t>
+      </w:r>
+      <w:r>
+        <w:rPr>
+          <w:rFonts w:hint="eastAsia"/>
+          <w:b/>
+          <w:bCs/>
+        </w:rPr>
+        <w:t>因果森林与异质性效应识别框架</w:t>
+      </w:r>
+    </w:p>
+    <w:p>
+      <w:pPr>
+        <w:ind w:left="898" w:firstLineChars="0" w:firstLine="0"/>
+      </w:pPr>
+      <w:r>
+        <w:rPr>
+          <w:rFonts w:hint="eastAsia"/>
+        </w:rPr>
+        <w:t>3.6.1 CATE</w:t>
+      </w:r>
+      <w:r>
+        <w:rPr>
+          <w:rFonts w:hint="eastAsia"/>
+        </w:rPr>
+        <w:t>识别思路</w:t>
+      </w:r>
+    </w:p>
+    <w:p>
+      <w:pPr>
+        <w:ind w:left="898" w:firstLineChars="0" w:firstLine="0"/>
+      </w:pPr>
+      <w:r>
+        <w:rPr>
+          <w:rFonts w:hint="eastAsia"/>
+        </w:rPr>
+        <w:t>3.6.2 Honest splitting</w:t>
+      </w:r>
+      <w:r>
+        <w:rPr>
+          <w:rFonts w:hint="eastAsia"/>
+        </w:rPr>
+        <w:t>与局部异质性估计</w:t>
+      </w:r>
+    </w:p>
+    <w:p>
+      <w:pPr>
+        <w:ind w:left="898" w:firstLineChars="0" w:firstLine="0"/>
+      </w:pPr>
+      <w:r>
+        <w:rPr>
+          <w:rFonts w:hint="eastAsia"/>
+        </w:rPr>
+        <w:t xml:space="preserve">3.6.3 </w:t>
+      </w:r>
+      <w:r>
+        <w:rPr>
+          <w:rFonts w:hint="eastAsia"/>
+        </w:rPr>
+        <w:t>因果森林与理论机制验证的关系</w:t>
+      </w:r>
+    </w:p>
+    <w:p>
+      <w:pPr>
         <w:ind w:firstLineChars="0" w:firstLine="0"/>
         <w:rPr>
           <w:b/>
@@ -2490,34 +2657,68 @@
     </w:p>
     <w:p>
       <w:pPr>
-        <w:ind w:firstLine="480"/>
-      </w:pPr>
-      <w:r>
-        <w:rPr>
-          <w:rFonts w:hint="eastAsia"/>
+        <w:ind w:firstLine="482"/>
+        <w:rPr>
+          <w:b/>
+          <w:bCs/>
+        </w:rPr>
+      </w:pPr>
+      <w:r>
+        <w:rPr>
+          <w:rFonts w:hint="eastAsia"/>
+          <w:b/>
+          <w:bCs/>
         </w:rPr>
         <w:t xml:space="preserve">4.1 </w:t>
       </w:r>
       <w:r>
         <w:rPr>
           <w:rFonts w:hint="eastAsia"/>
+          <w:b/>
+          <w:bCs/>
         </w:rPr>
         <w:t>样本选择与数据来源</w:t>
       </w:r>
     </w:p>
     <w:p>
       <w:pPr>
-        <w:ind w:firstLine="480"/>
-      </w:pPr>
-      <w:r>
-        <w:rPr>
-          <w:rFonts w:hint="eastAsia"/>
+        <w:ind w:left="900" w:firstLineChars="0" w:firstLine="0"/>
+      </w:pPr>
+      <w:r>
+        <w:t xml:space="preserve">4.1.1 </w:t>
+      </w:r>
+      <w:r>
+        <w:t>样本筛选标准与处理流程</w:t>
+      </w:r>
+      <w:r>
+        <w:br/>
+        <w:t xml:space="preserve">4.1.2 </w:t>
+      </w:r>
+      <w:r>
+        <w:t>数据来源与数据清洗说明</w:t>
+      </w:r>
+    </w:p>
+    <w:p>
+      <w:pPr>
+        <w:ind w:firstLine="482"/>
+        <w:rPr>
+          <w:b/>
+          <w:bCs/>
+        </w:rPr>
+      </w:pPr>
+      <w:r>
+        <w:rPr>
+          <w:rFonts w:hint="eastAsia"/>
+          <w:b/>
+          <w:bCs/>
         </w:rPr>
         <w:t xml:space="preserve">4.2 </w:t>
       </w:r>
       <w:r>
         <w:rPr>
           <w:rFonts w:hint="eastAsia"/>
+          <w:b/>
+          <w:bCs/>
         </w:rPr>
         <w:t>核心变量测度</w:t>
       </w:r>
@@ -2536,13 +2737,712 @@
         <w:rPr>
           <w:rFonts w:hint="eastAsia"/>
         </w:rPr>
-        <w:t>企业全要素生产率测度（</w:t>
-      </w:r>
-      <w:r>
-        <w:rPr>
-          <w:rFonts w:hint="eastAsia"/>
-        </w:rPr>
-        <w:t>LP/OP/ACF</w:t>
+        <w:t>被解释变量：企业全要素生产率（</w:t>
+      </w:r>
+      <w:r>
+        <w:rPr>
+          <w:rFonts w:hint="eastAsia"/>
+        </w:rPr>
+        <w:t>TFP</w:t>
+      </w:r>
+      <w:r>
+        <w:rPr>
+          <w:rFonts w:hint="eastAsia"/>
+        </w:rPr>
+        <w:t>）测度</w:t>
+      </w:r>
+    </w:p>
+    <w:p>
+      <w:pPr>
+        <w:ind w:firstLineChars="400" w:firstLine="960"/>
+      </w:pPr>
+      <w:r>
+        <w:rPr>
+          <w:rFonts w:hint="eastAsia"/>
+        </w:rPr>
+        <w:t xml:space="preserve">4.2.2 </w:t>
+      </w:r>
+      <w:r>
+        <w:rPr>
+          <w:rFonts w:hint="eastAsia"/>
+        </w:rPr>
+        <w:t>核心解释变量：数据要素赋能指标构建（文本挖掘</w:t>
+      </w:r>
+      <w:r>
+        <w:rPr>
+          <w:rFonts w:hint="eastAsia"/>
+        </w:rPr>
+        <w:t>/</w:t>
+      </w:r>
+      <w:r>
+        <w:rPr>
+          <w:rFonts w:hint="eastAsia"/>
+        </w:rPr>
+        <w:t>词典法</w:t>
+      </w:r>
+      <w:r>
+        <w:rPr>
+          <w:rFonts w:hint="eastAsia"/>
+        </w:rPr>
+        <w:t>/</w:t>
+      </w:r>
+      <w:r>
+        <w:rPr>
+          <w:rFonts w:hint="eastAsia"/>
+        </w:rPr>
+        <w:t>指数法）</w:t>
+      </w:r>
+    </w:p>
+    <w:p>
+      <w:pPr>
+        <w:ind w:firstLineChars="400" w:firstLine="960"/>
+      </w:pPr>
+      <w:r>
+        <w:rPr>
+          <w:rFonts w:hint="eastAsia"/>
+        </w:rPr>
+        <w:t xml:space="preserve">4.2.3 </w:t>
+      </w:r>
+      <w:r>
+        <w:rPr>
+          <w:rFonts w:hint="eastAsia"/>
+        </w:rPr>
+        <w:t>控制变量与机制变量定义</w:t>
+      </w:r>
+    </w:p>
+    <w:p>
+      <w:pPr>
+        <w:ind w:firstLineChars="400" w:firstLine="960"/>
+      </w:pPr>
+      <w:r>
+        <w:rPr>
+          <w:rFonts w:hint="eastAsia"/>
+        </w:rPr>
+        <w:t xml:space="preserve">4.2.4 </w:t>
+      </w:r>
+      <w:r>
+        <w:rPr>
+          <w:rFonts w:hint="eastAsia"/>
+        </w:rPr>
+        <w:t>异质性分组变量定义（规模、行业、融资约束、区域数字基础设施等</w:t>
+      </w:r>
+    </w:p>
+    <w:p>
+      <w:pPr>
+        <w:ind w:firstLine="482"/>
+        <w:rPr>
+          <w:b/>
+          <w:bCs/>
+        </w:rPr>
+      </w:pPr>
+      <w:r>
+        <w:rPr>
+          <w:rFonts w:hint="eastAsia"/>
+          <w:b/>
+          <w:bCs/>
+        </w:rPr>
+        <w:t xml:space="preserve">4.3 </w:t>
+      </w:r>
+      <w:r>
+        <w:rPr>
+          <w:rFonts w:hint="eastAsia"/>
+          <w:b/>
+          <w:bCs/>
+        </w:rPr>
+        <w:t>基准经验模型与识别策略</w:t>
+      </w:r>
+    </w:p>
+    <w:p>
+      <w:pPr>
+        <w:ind w:firstLineChars="400" w:firstLine="960"/>
+      </w:pPr>
+      <w:r>
+        <w:rPr>
+          <w:rFonts w:hint="eastAsia"/>
+        </w:rPr>
+        <w:t xml:space="preserve">4.3.1 </w:t>
+      </w:r>
+      <w:r>
+        <w:rPr>
+          <w:rFonts w:hint="eastAsia"/>
+        </w:rPr>
+        <w:t>基准回归模型（固定效应模型）</w:t>
+      </w:r>
+    </w:p>
+    <w:p>
+      <w:pPr>
+        <w:ind w:firstLineChars="400" w:firstLine="960"/>
+      </w:pPr>
+      <w:r>
+        <w:rPr>
+          <w:rFonts w:hint="eastAsia"/>
+        </w:rPr>
+        <w:t xml:space="preserve">4.3.2 </w:t>
+      </w:r>
+      <w:r>
+        <w:rPr>
+          <w:rFonts w:hint="eastAsia"/>
+        </w:rPr>
+        <w:t>内生性问题与识别思路</w:t>
+      </w:r>
+    </w:p>
+    <w:p>
+      <w:pPr>
+        <w:ind w:firstLineChars="400" w:firstLine="960"/>
+      </w:pPr>
+      <w:r>
+        <w:rPr>
+          <w:rFonts w:hint="eastAsia"/>
+        </w:rPr>
+        <w:t xml:space="preserve">4.3.3 </w:t>
+      </w:r>
+      <w:r>
+        <w:rPr>
+          <w:rFonts w:hint="eastAsia"/>
+        </w:rPr>
+        <w:t>双重机器学习（</w:t>
+      </w:r>
+      <w:r>
+        <w:rPr>
+          <w:rFonts w:hint="eastAsia"/>
+        </w:rPr>
+        <w:t>DML</w:t>
+      </w:r>
+      <w:r>
+        <w:rPr>
+          <w:rFonts w:hint="eastAsia"/>
+        </w:rPr>
+        <w:t>）估计设定</w:t>
+      </w:r>
+    </w:p>
+    <w:p>
+      <w:pPr>
+        <w:ind w:firstLineChars="400" w:firstLine="960"/>
+      </w:pPr>
+      <w:r>
+        <w:rPr>
+          <w:rFonts w:hint="eastAsia"/>
+        </w:rPr>
+        <w:t xml:space="preserve">4.3.4 </w:t>
+      </w:r>
+      <w:r>
+        <w:rPr>
+          <w:rFonts w:hint="eastAsia"/>
+        </w:rPr>
+        <w:t>因果森林（</w:t>
+      </w:r>
+      <w:r>
+        <w:rPr>
+          <w:rFonts w:hint="eastAsia"/>
+        </w:rPr>
+        <w:t>Causal Forest</w:t>
+      </w:r>
+      <w:r>
+        <w:rPr>
+          <w:rFonts w:hint="eastAsia"/>
+        </w:rPr>
+        <w:t>）估计设定</w:t>
+      </w:r>
+    </w:p>
+    <w:p>
+      <w:pPr>
+        <w:ind w:firstLine="482"/>
+        <w:rPr>
+          <w:b/>
+          <w:bCs/>
+        </w:rPr>
+      </w:pPr>
+      <w:r>
+        <w:rPr>
+          <w:b/>
+          <w:bCs/>
+        </w:rPr>
+        <w:t xml:space="preserve">4.4 </w:t>
+      </w:r>
+      <w:r>
+        <w:rPr>
+          <w:b/>
+          <w:bCs/>
+        </w:rPr>
+        <w:t>稳健性检验设计与评估方案</w:t>
+      </w:r>
+    </w:p>
+    <w:p>
+      <w:pPr>
+        <w:ind w:leftChars="400" w:left="960" w:firstLineChars="0" w:firstLine="0"/>
+      </w:pPr>
+      <w:r>
+        <w:lastRenderedPageBreak/>
+        <w:t xml:space="preserve">4.4.1 </w:t>
+      </w:r>
+      <w:r>
+        <w:t>替代变量与样本重估</w:t>
+      </w:r>
+      <w:r>
+        <w:br/>
+        <w:t>4.4.2 PSM/IV/</w:t>
+      </w:r>
+      <w:r>
+        <w:t>安慰剂检验</w:t>
+      </w:r>
+      <w:r>
+        <w:br/>
+        <w:t xml:space="preserve">4.4.3 </w:t>
+      </w:r>
+      <w:r>
+        <w:t>模型评估与交叉验证方案</w:t>
+      </w:r>
+    </w:p>
+    <w:p>
+      <w:pPr>
+        <w:ind w:firstLineChars="0" w:firstLine="0"/>
+        <w:rPr>
+          <w:b/>
+          <w:bCs/>
+        </w:rPr>
+      </w:pPr>
+      <w:r>
+        <w:rPr>
+          <w:rFonts w:hint="eastAsia"/>
+          <w:b/>
+          <w:bCs/>
+        </w:rPr>
+        <w:t>第</w:t>
+      </w:r>
+      <w:r>
+        <w:rPr>
+          <w:rFonts w:hint="eastAsia"/>
+          <w:b/>
+          <w:bCs/>
+        </w:rPr>
+        <w:t>5</w:t>
+      </w:r>
+      <w:r>
+        <w:rPr>
+          <w:rFonts w:hint="eastAsia"/>
+          <w:b/>
+          <w:bCs/>
+        </w:rPr>
+        <w:t>章</w:t>
+      </w:r>
+      <w:r>
+        <w:rPr>
+          <w:rFonts w:hint="eastAsia"/>
+          <w:b/>
+          <w:bCs/>
+        </w:rPr>
+        <w:t xml:space="preserve"> </w:t>
+      </w:r>
+      <w:r>
+        <w:rPr>
+          <w:rFonts w:hint="eastAsia"/>
+          <w:b/>
+          <w:bCs/>
+        </w:rPr>
+        <w:t>数据要素赋能对企业</w:t>
+      </w:r>
+      <w:r>
+        <w:rPr>
+          <w:rFonts w:hint="eastAsia"/>
+          <w:b/>
+          <w:bCs/>
+        </w:rPr>
+        <w:t>TFP</w:t>
+      </w:r>
+      <w:r>
+        <w:rPr>
+          <w:rFonts w:hint="eastAsia"/>
+          <w:b/>
+          <w:bCs/>
+        </w:rPr>
+        <w:t>的平均效应检验</w:t>
+      </w:r>
+    </w:p>
+    <w:p>
+      <w:pPr>
+        <w:ind w:firstLineChars="183" w:firstLine="441"/>
+        <w:rPr>
+          <w:b/>
+          <w:bCs/>
+        </w:rPr>
+      </w:pPr>
+      <w:r>
+        <w:rPr>
+          <w:rFonts w:hint="eastAsia"/>
+          <w:b/>
+          <w:bCs/>
+        </w:rPr>
+        <w:t xml:space="preserve">5.1 </w:t>
+      </w:r>
+      <w:r>
+        <w:rPr>
+          <w:rFonts w:hint="eastAsia"/>
+          <w:b/>
+          <w:bCs/>
+        </w:rPr>
+        <w:t>描述性统计与相关性分析</w:t>
+      </w:r>
+    </w:p>
+    <w:p>
+      <w:pPr>
+        <w:ind w:firstLineChars="183" w:firstLine="441"/>
+        <w:rPr>
+          <w:b/>
+          <w:bCs/>
+        </w:rPr>
+      </w:pPr>
+      <w:r>
+        <w:rPr>
+          <w:rFonts w:hint="eastAsia"/>
+          <w:b/>
+          <w:bCs/>
+        </w:rPr>
+        <w:t xml:space="preserve">5.2 </w:t>
+      </w:r>
+      <w:r>
+        <w:rPr>
+          <w:rFonts w:hint="eastAsia"/>
+          <w:b/>
+          <w:bCs/>
+        </w:rPr>
+        <w:t>基准回归结果（固定效应）</w:t>
+      </w:r>
+    </w:p>
+    <w:p>
+      <w:pPr>
+        <w:ind w:firstLineChars="183" w:firstLine="441"/>
+        <w:rPr>
+          <w:b/>
+          <w:bCs/>
+        </w:rPr>
+      </w:pPr>
+      <w:r>
+        <w:rPr>
+          <w:rFonts w:hint="eastAsia"/>
+          <w:b/>
+          <w:bCs/>
+        </w:rPr>
+        <w:t xml:space="preserve">5.3 </w:t>
+      </w:r>
+      <w:r>
+        <w:rPr>
+          <w:rFonts w:hint="eastAsia"/>
+          <w:b/>
+          <w:bCs/>
+        </w:rPr>
+        <w:t>内生性处理与稳健性检验</w:t>
+      </w:r>
+    </w:p>
+    <w:p>
+      <w:pPr>
+        <w:ind w:left="401" w:firstLineChars="183" w:firstLine="439"/>
+      </w:pPr>
+      <w:r>
+        <w:rPr>
+          <w:rFonts w:hint="eastAsia"/>
+        </w:rPr>
+        <w:t xml:space="preserve">5.3.1 </w:t>
+      </w:r>
+      <w:r>
+        <w:rPr>
+          <w:rFonts w:hint="eastAsia"/>
+        </w:rPr>
+        <w:t>倾向得分匹配（</w:t>
+      </w:r>
+      <w:r>
+        <w:rPr>
+          <w:rFonts w:hint="eastAsia"/>
+        </w:rPr>
+        <w:t>PSM</w:t>
+      </w:r>
+      <w:r>
+        <w:rPr>
+          <w:rFonts w:hint="eastAsia"/>
+        </w:rPr>
+        <w:t>）检验</w:t>
+      </w:r>
+    </w:p>
+    <w:p>
+      <w:pPr>
+        <w:ind w:left="401" w:firstLineChars="183" w:firstLine="439"/>
+      </w:pPr>
+      <w:r>
+        <w:rPr>
+          <w:rFonts w:hint="eastAsia"/>
+        </w:rPr>
+        <w:t xml:space="preserve">5.3.2 </w:t>
+      </w:r>
+      <w:r>
+        <w:rPr>
+          <w:rFonts w:hint="eastAsia"/>
+        </w:rPr>
+        <w:t>工具变量（</w:t>
+      </w:r>
+      <w:r>
+        <w:rPr>
+          <w:rFonts w:hint="eastAsia"/>
+        </w:rPr>
+        <w:t>IV</w:t>
+      </w:r>
+      <w:r>
+        <w:rPr>
+          <w:rFonts w:hint="eastAsia"/>
+        </w:rPr>
+        <w:t>）检验</w:t>
+      </w:r>
+    </w:p>
+    <w:p>
+      <w:pPr>
+        <w:ind w:left="401" w:firstLineChars="183" w:firstLine="439"/>
+      </w:pPr>
+      <w:r>
+        <w:rPr>
+          <w:rFonts w:hint="eastAsia"/>
+        </w:rPr>
+        <w:t xml:space="preserve">5.3.3 </w:t>
+      </w:r>
+      <w:r>
+        <w:rPr>
+          <w:rFonts w:hint="eastAsia"/>
+        </w:rPr>
+        <w:t>替代变量检验</w:t>
+      </w:r>
+    </w:p>
+    <w:p>
+      <w:pPr>
+        <w:ind w:left="401" w:firstLineChars="183" w:firstLine="439"/>
+      </w:pPr>
+      <w:r>
+        <w:rPr>
+          <w:rFonts w:hint="eastAsia"/>
+        </w:rPr>
+        <w:t xml:space="preserve">5.3.4 </w:t>
+      </w:r>
+      <w:r>
+        <w:rPr>
+          <w:rFonts w:hint="eastAsia"/>
+        </w:rPr>
+        <w:t>安慰剂检验</w:t>
+      </w:r>
+    </w:p>
+    <w:p>
+      <w:pPr>
+        <w:ind w:left="401" w:firstLineChars="183" w:firstLine="439"/>
+      </w:pPr>
+      <w:r>
+        <w:rPr>
+          <w:rFonts w:hint="eastAsia"/>
+        </w:rPr>
+        <w:t xml:space="preserve">5.3.5 </w:t>
+      </w:r>
+      <w:r>
+        <w:rPr>
+          <w:rFonts w:hint="eastAsia"/>
+        </w:rPr>
+        <w:t>样本重估检验</w:t>
+      </w:r>
+    </w:p>
+    <w:p>
+      <w:pPr>
+        <w:ind w:firstLineChars="0" w:firstLine="401"/>
+        <w:rPr>
+          <w:b/>
+          <w:bCs/>
+        </w:rPr>
+      </w:pPr>
+      <w:r>
+        <w:rPr>
+          <w:b/>
+          <w:bCs/>
+        </w:rPr>
+        <w:t xml:space="preserve">5.4 </w:t>
+      </w:r>
+      <w:r>
+        <w:rPr>
+          <w:b/>
+          <w:bCs/>
+        </w:rPr>
+        <w:t>双重机器学习（</w:t>
+      </w:r>
+      <w:r>
+        <w:rPr>
+          <w:b/>
+          <w:bCs/>
+        </w:rPr>
+        <w:t>DML</w:t>
+      </w:r>
+      <w:r>
+        <w:rPr>
+          <w:b/>
+          <w:bCs/>
+        </w:rPr>
+        <w:t>）稳健估计结果</w:t>
+      </w:r>
+    </w:p>
+    <w:p>
+      <w:pPr>
+        <w:ind w:left="420" w:firstLineChars="0" w:firstLine="420"/>
+      </w:pPr>
+      <w:r>
+        <w:rPr>
+          <w:rFonts w:hint="eastAsia"/>
+        </w:rPr>
+        <w:t>5.4.1 DML</w:t>
+      </w:r>
+      <w:r>
+        <w:rPr>
+          <w:rFonts w:hint="eastAsia"/>
+        </w:rPr>
+        <w:t>平均效应估计结果</w:t>
+      </w:r>
+    </w:p>
+    <w:p>
+      <w:pPr>
+        <w:ind w:left="420" w:firstLineChars="0" w:firstLine="420"/>
+      </w:pPr>
+      <w:r>
+        <w:rPr>
+          <w:rFonts w:hint="eastAsia"/>
+        </w:rPr>
+        <w:t xml:space="preserve">5.4.2 </w:t>
+      </w:r>
+      <w:r>
+        <w:rPr>
+          <w:rFonts w:hint="eastAsia"/>
+        </w:rPr>
+        <w:t>不同算法设定下的稳健性比较（</w:t>
+      </w:r>
+      <w:r>
+        <w:rPr>
+          <w:rFonts w:hint="eastAsia"/>
+        </w:rPr>
+        <w:t>Lasso/RF/GBDT</w:t>
+      </w:r>
+      <w:r>
+        <w:rPr>
+          <w:rFonts w:hint="eastAsia"/>
+        </w:rPr>
+        <w:t>等）</w:t>
+      </w:r>
+    </w:p>
+    <w:p>
+      <w:pPr>
+        <w:ind w:firstLineChars="0" w:firstLine="420"/>
+        <w:rPr>
+          <w:b/>
+          <w:bCs/>
+        </w:rPr>
+      </w:pPr>
+      <w:r>
+        <w:rPr>
+          <w:b/>
+          <w:bCs/>
+        </w:rPr>
+        <w:t xml:space="preserve">5.5 </w:t>
+      </w:r>
+      <w:r>
+        <w:rPr>
+          <w:b/>
+          <w:bCs/>
+        </w:rPr>
+        <w:t>经济意义分析</w:t>
+      </w:r>
+    </w:p>
+    <w:p>
+      <w:pPr>
+        <w:ind w:firstLineChars="0" w:firstLine="0"/>
+        <w:rPr>
+          <w:b/>
+          <w:bCs/>
+        </w:rPr>
+      </w:pPr>
+      <w:r>
+        <w:rPr>
+          <w:rFonts w:hint="eastAsia"/>
+          <w:b/>
+          <w:bCs/>
+        </w:rPr>
+        <w:t>第</w:t>
+      </w:r>
+      <w:r>
+        <w:rPr>
+          <w:rFonts w:hint="eastAsia"/>
+          <w:b/>
+          <w:bCs/>
+        </w:rPr>
+        <w:t>6</w:t>
+      </w:r>
+      <w:r>
+        <w:rPr>
+          <w:rFonts w:hint="eastAsia"/>
+          <w:b/>
+          <w:bCs/>
+        </w:rPr>
+        <w:t>章</w:t>
+      </w:r>
+      <w:r>
+        <w:rPr>
+          <w:rFonts w:hint="eastAsia"/>
+          <w:b/>
+          <w:bCs/>
+        </w:rPr>
+        <w:t xml:space="preserve"> </w:t>
+      </w:r>
+      <w:r>
+        <w:rPr>
+          <w:rFonts w:hint="eastAsia"/>
+          <w:b/>
+          <w:bCs/>
+        </w:rPr>
+        <w:t>基于因果森林的异质性因果效应识别</w:t>
+      </w:r>
+    </w:p>
+    <w:p>
+      <w:pPr>
+        <w:ind w:firstLine="482"/>
+        <w:rPr>
+          <w:b/>
+          <w:bCs/>
+        </w:rPr>
+      </w:pPr>
+      <w:r>
+        <w:rPr>
+          <w:rFonts w:hint="eastAsia"/>
+          <w:b/>
+          <w:bCs/>
+        </w:rPr>
+        <w:t xml:space="preserve">6.1 </w:t>
+      </w:r>
+      <w:r>
+        <w:rPr>
+          <w:rFonts w:hint="eastAsia"/>
+          <w:b/>
+          <w:bCs/>
+        </w:rPr>
+        <w:t>因果森林模型原理</w:t>
+      </w:r>
+    </w:p>
+    <w:p>
+      <w:pPr>
+        <w:ind w:firstLineChars="400" w:firstLine="960"/>
+      </w:pPr>
+      <w:r>
+        <w:rPr>
+          <w:rFonts w:hint="eastAsia"/>
+        </w:rPr>
+        <w:t xml:space="preserve">6.1.1 </w:t>
+      </w:r>
+      <w:r>
+        <w:rPr>
+          <w:rFonts w:hint="eastAsia"/>
+        </w:rPr>
+        <w:t>条件平均处理效应（</w:t>
+      </w:r>
+      <w:r>
+        <w:rPr>
+          <w:rFonts w:hint="eastAsia"/>
+        </w:rPr>
+        <w:t>CATE</w:t>
       </w:r>
       <w:r>
         <w:rPr>
@@ -2559,139 +3459,199 @@
         <w:rPr>
           <w:rFonts w:hint="eastAsia"/>
         </w:rPr>
-        <w:t xml:space="preserve">4.2.2 </w:t>
-      </w:r>
-      <w:r>
-        <w:rPr>
-          <w:rFonts w:hint="eastAsia"/>
-        </w:rPr>
-        <w:t>数据要素赋能指标构建（文本挖掘</w:t>
-      </w:r>
-      <w:r>
-        <w:rPr>
-          <w:rFonts w:hint="eastAsia"/>
-        </w:rPr>
+        <w:t>6.1.2 Honest splitting</w:t>
+      </w:r>
+      <w:r>
+        <w:rPr>
+          <w:rFonts w:hint="eastAsia"/>
+        </w:rPr>
+        <w:t>与交叉拟合</w:t>
+      </w:r>
+    </w:p>
+    <w:p>
+      <w:pPr>
+        <w:ind w:firstLineChars="400" w:firstLine="960"/>
+      </w:pPr>
+      <w:r>
+        <w:rPr>
+          <w:rFonts w:hint="eastAsia"/>
+        </w:rPr>
+        <w:t xml:space="preserve">6.1.3 </w:t>
+      </w:r>
+      <w:r>
+        <w:t>变量重要性与解释性分析</w:t>
+      </w:r>
+    </w:p>
+    <w:p>
+      <w:pPr>
+        <w:ind w:firstLine="482"/>
+        <w:rPr>
+          <w:b/>
+          <w:bCs/>
+        </w:rPr>
+      </w:pPr>
+      <w:r>
+        <w:rPr>
+          <w:rFonts w:hint="eastAsia"/>
+          <w:b/>
+          <w:bCs/>
+        </w:rPr>
+        <w:t>6.2</w:t>
+      </w:r>
+      <w:r>
+        <w:rPr>
+          <w:b/>
+          <w:bCs/>
+        </w:rPr>
+        <w:t xml:space="preserve"> </w:t>
+      </w:r>
+      <w:r>
+        <w:rPr>
+          <w:b/>
+          <w:bCs/>
+        </w:rPr>
+        <w:t>模型设定、参数选择与训练方案</w:t>
+      </w:r>
+    </w:p>
+    <w:p>
+      <w:pPr>
+        <w:ind w:firstLine="482"/>
+        <w:rPr>
+          <w:b/>
+          <w:bCs/>
+        </w:rPr>
+      </w:pPr>
+      <w:r>
+        <w:rPr>
+          <w:rFonts w:hint="eastAsia"/>
+          <w:b/>
+          <w:bCs/>
+        </w:rPr>
+        <w:t xml:space="preserve">6.3 </w:t>
+      </w:r>
+      <w:r>
+        <w:rPr>
+          <w:b/>
+          <w:bCs/>
+        </w:rPr>
+        <w:t>个体处理效应估计结果与分布特征</w:t>
+      </w:r>
+    </w:p>
+    <w:p>
+      <w:pPr>
+        <w:ind w:left="840" w:firstLineChars="24" w:firstLine="58"/>
+      </w:pPr>
+      <w:r>
+        <w:t xml:space="preserve">6.3.1 </w:t>
+      </w:r>
+      <w:r>
+        <w:t>个体效应分布与长尾特征</w:t>
+      </w:r>
+      <w:r>
+        <w:br/>
+        <w:t xml:space="preserve">6.3.2 </w:t>
+      </w:r>
+      <w:r>
+        <w:t>分位数差异分析</w:t>
+      </w:r>
+      <w:r>
+        <w:br/>
+        <w:t xml:space="preserve">6.3.3 </w:t>
+      </w:r>
+      <w:r>
+        <w:t>极端受益</w:t>
+      </w:r>
+      <w:r>
         <w:t>/</w:t>
       </w:r>
       <w:r>
-        <w:rPr>
-          <w:rFonts w:hint="eastAsia"/>
-        </w:rPr>
-        <w:t>词典法</w:t>
-      </w:r>
-      <w:r>
-        <w:rPr>
-          <w:rFonts w:hint="eastAsia"/>
-        </w:rPr>
-        <w:t>/</w:t>
-      </w:r>
-      <w:r>
-        <w:rPr>
-          <w:rFonts w:hint="eastAsia"/>
-        </w:rPr>
-        <w:t>指数法）</w:t>
-      </w:r>
-    </w:p>
-    <w:p>
-      <w:pPr>
-        <w:ind w:firstLineChars="400" w:firstLine="960"/>
-      </w:pPr>
-      <w:r>
-        <w:rPr>
-          <w:rFonts w:hint="eastAsia"/>
-        </w:rPr>
-        <w:t xml:space="preserve">4.2.3 </w:t>
-      </w:r>
-      <w:r>
-        <w:rPr>
-          <w:rFonts w:hint="eastAsia"/>
-        </w:rPr>
-        <w:t>控制变量与中介变量</w:t>
-      </w:r>
-    </w:p>
-    <w:p>
-      <w:pPr>
-        <w:ind w:firstLine="480"/>
-      </w:pPr>
-      <w:r>
-        <w:rPr>
-          <w:rFonts w:hint="eastAsia"/>
-        </w:rPr>
-        <w:t xml:space="preserve">4.3 </w:t>
-      </w:r>
-      <w:r>
-        <w:rPr>
-          <w:rFonts w:hint="eastAsia"/>
-        </w:rPr>
-        <w:t>基准识别模型</w:t>
-      </w:r>
-    </w:p>
-    <w:p>
-      <w:pPr>
-        <w:ind w:firstLineChars="400" w:firstLine="960"/>
-      </w:pPr>
-      <w:r>
-        <w:rPr>
-          <w:rFonts w:hint="eastAsia"/>
-        </w:rPr>
-        <w:t xml:space="preserve">4.3.1 </w:t>
-      </w:r>
-      <w:r>
-        <w:rPr>
-          <w:rFonts w:hint="eastAsia"/>
-        </w:rPr>
-        <w:t>多期</w:t>
-      </w:r>
-      <w:r>
-        <w:rPr>
-          <w:rFonts w:hint="eastAsia"/>
-        </w:rPr>
-        <w:t>DID</w:t>
-      </w:r>
-      <w:r>
-        <w:rPr>
-          <w:rFonts w:hint="eastAsia"/>
-        </w:rPr>
-        <w:t>模型</w:t>
-      </w:r>
-    </w:p>
-    <w:p>
-      <w:pPr>
-        <w:ind w:firstLineChars="400" w:firstLine="960"/>
-      </w:pPr>
-      <w:r>
-        <w:rPr>
-          <w:rFonts w:hint="eastAsia"/>
-        </w:rPr>
-        <w:t xml:space="preserve">4.3.2 </w:t>
-      </w:r>
-      <w:r>
-        <w:rPr>
-          <w:rFonts w:hint="eastAsia"/>
-        </w:rPr>
-        <w:t>内生性与识别假设</w:t>
-      </w:r>
-    </w:p>
-    <w:p>
-      <w:pPr>
-        <w:ind w:firstLineChars="400" w:firstLine="960"/>
-      </w:pPr>
-      <w:r>
-        <w:rPr>
-          <w:rFonts w:hint="eastAsia"/>
-        </w:rPr>
-        <w:t xml:space="preserve">4.3.3 </w:t>
-      </w:r>
-      <w:r>
-        <w:rPr>
-          <w:rFonts w:hint="eastAsia"/>
-        </w:rPr>
-        <w:t>稳健性与平行趋势检验</w:t>
-      </w:r>
-    </w:p>
-    <w:p>
-      <w:pPr>
-        <w:ind w:firstLineChars="0" w:firstLine="0"/>
+        <w:t>受损企业识别</w:t>
+      </w:r>
+    </w:p>
+    <w:p>
+      <w:pPr>
+        <w:ind w:firstLineChars="182" w:firstLine="439"/>
+        <w:rPr>
+          <w:b/>
+          <w:bCs/>
+        </w:rPr>
+      </w:pPr>
+      <w:r>
+        <w:rPr>
+          <w:rFonts w:hint="eastAsia"/>
+          <w:b/>
+          <w:bCs/>
+        </w:rPr>
+        <w:t xml:space="preserve">6.4 </w:t>
+      </w:r>
+      <w:r>
+        <w:rPr>
+          <w:rFonts w:hint="eastAsia"/>
+          <w:b/>
+          <w:bCs/>
+        </w:rPr>
+        <w:t>异质性影响特征分析</w:t>
+      </w:r>
+    </w:p>
+    <w:p>
+      <w:pPr>
+        <w:ind w:left="840" w:firstLineChars="7" w:firstLine="17"/>
+      </w:pPr>
+      <w:r>
+        <w:t xml:space="preserve">6.4.1 </w:t>
+      </w:r>
+      <w:r>
+        <w:t>企业规模维度</w:t>
+      </w:r>
+      <w:r>
+        <w:br/>
+        <w:t xml:space="preserve">6.4.2 </w:t>
+      </w:r>
+      <w:r>
+        <w:t>行业技术特征维度</w:t>
+      </w:r>
+      <w:r>
+        <w:br/>
+        <w:t xml:space="preserve">6.4.3 </w:t>
+      </w:r>
+      <w:r>
+        <w:t>融资约束维度</w:t>
+      </w:r>
+      <w:r>
+        <w:br/>
+        <w:t xml:space="preserve">6.4.4 </w:t>
+      </w:r>
+      <w:r>
+        <w:t>区域数字基础设施维度</w:t>
+      </w:r>
+    </w:p>
+    <w:p>
+      <w:pPr>
+        <w:ind w:firstLineChars="182" w:firstLine="439"/>
+        <w:rPr>
+          <w:b/>
+          <w:bCs/>
+        </w:rPr>
+      </w:pPr>
+      <w:r>
+        <w:rPr>
+          <w:b/>
+          <w:bCs/>
+        </w:rPr>
+        <w:lastRenderedPageBreak/>
+        <w:t xml:space="preserve">6.5 </w:t>
+      </w:r>
+      <w:r>
+        <w:rPr>
+          <w:b/>
+          <w:bCs/>
+        </w:rPr>
+        <w:t>异质性识别结果的小结与讨论</w:t>
+      </w:r>
+    </w:p>
+    <w:p>
+      <w:pPr>
+        <w:ind w:firstLineChars="83"/>
         <w:rPr>
           <w:b/>
           <w:bCs/>
@@ -2711,7 +3671,7 @@
           <w:b/>
           <w:bCs/>
         </w:rPr>
-        <w:t>5</w:t>
+        <w:t>7</w:t>
       </w:r>
       <w:r>
         <w:rPr>
@@ -2735,141 +3695,169 @@
           <w:b/>
           <w:bCs/>
         </w:rPr>
-        <w:t>平均效应：数据要素对</w:t>
-      </w:r>
-      <w:r>
-        <w:rPr>
-          <w:rFonts w:hint="eastAsia"/>
-          <w:b/>
-          <w:bCs/>
-        </w:rPr>
-        <w:t>TFP</w:t>
-      </w:r>
-      <w:r>
-        <w:rPr>
-          <w:rFonts w:hint="eastAsia"/>
-          <w:b/>
-          <w:bCs/>
-        </w:rPr>
-        <w:t>的影响检验</w:t>
-      </w:r>
-    </w:p>
-    <w:p>
-      <w:pPr>
-        <w:ind w:firstLineChars="183" w:firstLine="439"/>
-      </w:pPr>
-      <w:r>
-        <w:rPr>
-          <w:rFonts w:hint="eastAsia"/>
-        </w:rPr>
-        <w:t xml:space="preserve">5.1 </w:t>
-      </w:r>
-      <w:r>
-        <w:rPr>
-          <w:rFonts w:hint="eastAsia"/>
-        </w:rPr>
-        <w:t>基准回归结果</w:t>
-      </w:r>
-    </w:p>
-    <w:p>
-      <w:pPr>
-        <w:ind w:firstLineChars="183" w:firstLine="439"/>
-      </w:pPr>
-      <w:r>
-        <w:rPr>
-          <w:rFonts w:hint="eastAsia"/>
-        </w:rPr>
-        <w:t xml:space="preserve">5.2 </w:t>
-      </w:r>
-      <w:r>
-        <w:rPr>
-          <w:rFonts w:hint="eastAsia"/>
-        </w:rPr>
-        <w:t>内生性处理（</w:t>
-      </w:r>
-      <w:r>
-        <w:rPr>
-          <w:rFonts w:hint="eastAsia"/>
-        </w:rPr>
-        <w:t>PSM/</w:t>
-      </w:r>
-      <w:r>
-        <w:rPr>
-          <w:rFonts w:hint="eastAsia"/>
-        </w:rPr>
-        <w:t>工具变量）</w:t>
-      </w:r>
-    </w:p>
-    <w:p>
-      <w:pPr>
-        <w:ind w:firstLineChars="183" w:firstLine="439"/>
-      </w:pPr>
-      <w:r>
-        <w:rPr>
-          <w:rFonts w:hint="eastAsia"/>
-        </w:rPr>
-        <w:t xml:space="preserve">5.3 </w:t>
-      </w:r>
-      <w:r>
-        <w:rPr>
-          <w:rFonts w:hint="eastAsia"/>
-        </w:rPr>
-        <w:t>稳健性检验</w:t>
-      </w:r>
-    </w:p>
-    <w:p>
-      <w:pPr>
-        <w:ind w:firstLineChars="383" w:firstLine="919"/>
-      </w:pPr>
-      <w:r>
-        <w:rPr>
-          <w:rFonts w:hint="eastAsia"/>
-        </w:rPr>
-        <w:t>替换变量</w:t>
-      </w:r>
-    </w:p>
-    <w:p>
-      <w:pPr>
-        <w:ind w:firstLineChars="383" w:firstLine="919"/>
-      </w:pPr>
-      <w:r>
-        <w:rPr>
-          <w:rFonts w:hint="eastAsia"/>
-        </w:rPr>
-        <w:t>安慰剂检验</w:t>
-      </w:r>
-    </w:p>
-    <w:p>
-      <w:pPr>
-        <w:ind w:firstLineChars="383" w:firstLine="919"/>
-      </w:pPr>
-      <w:r>
-        <w:rPr>
-          <w:rFonts w:hint="eastAsia"/>
-        </w:rPr>
-        <w:t>样本重估</w:t>
-      </w:r>
-    </w:p>
-    <w:p>
-      <w:pPr>
-        <w:ind w:firstLineChars="183" w:firstLine="439"/>
-      </w:pPr>
-      <w:r>
-        <w:rPr>
-          <w:rFonts w:hint="eastAsia"/>
-        </w:rPr>
-        <w:t xml:space="preserve">5.4 </w:t>
-      </w:r>
-      <w:r>
-        <w:rPr>
-          <w:rFonts w:hint="eastAsia"/>
-        </w:rPr>
-        <w:t>经济意义分析</w:t>
-      </w:r>
-    </w:p>
-    <w:p>
-      <w:pPr>
-        <w:ind w:firstLineChars="0" w:firstLine="0"/>
+        <w:t>作用机制与传导路径检验</w:t>
+      </w:r>
+    </w:p>
+    <w:p>
+      <w:pPr>
+        <w:ind w:firstLineChars="83" w:firstLine="199"/>
+        <w:rPr>
+          <w:b/>
+          <w:bCs/>
+        </w:rPr>
+      </w:pPr>
+      <w:r>
+        <w:rPr>
+          <w:rFonts w:hint="eastAsia"/>
+        </w:rPr>
+        <w:tab/>
+        <w:t xml:space="preserve">  </w:t>
+      </w:r>
+      <w:r>
+        <w:rPr>
+          <w:rFonts w:hint="eastAsia"/>
+          <w:b/>
+          <w:bCs/>
+        </w:rPr>
+        <w:t xml:space="preserve">7.1 </w:t>
+      </w:r>
+      <w:r>
+        <w:rPr>
+          <w:rFonts w:hint="eastAsia"/>
+          <w:b/>
+          <w:bCs/>
+        </w:rPr>
+        <w:t>机制检验模型设定与识别思路</w:t>
+      </w:r>
+    </w:p>
+    <w:p>
+      <w:pPr>
+        <w:ind w:firstLineChars="283" w:firstLine="682"/>
+        <w:rPr>
+          <w:b/>
+          <w:bCs/>
+        </w:rPr>
+      </w:pPr>
+      <w:r>
+        <w:rPr>
+          <w:rFonts w:hint="eastAsia"/>
+          <w:b/>
+          <w:bCs/>
+        </w:rPr>
+        <w:t xml:space="preserve">7.2 </w:t>
+      </w:r>
+      <w:r>
+        <w:rPr>
+          <w:rFonts w:hint="eastAsia"/>
+          <w:b/>
+          <w:bCs/>
+        </w:rPr>
+        <w:t>资源配置效率机制检验</w:t>
+      </w:r>
+    </w:p>
+    <w:p>
+      <w:pPr>
+        <w:ind w:firstLineChars="283" w:firstLine="682"/>
+        <w:rPr>
+          <w:b/>
+          <w:bCs/>
+        </w:rPr>
+      </w:pPr>
+      <w:r>
+        <w:rPr>
+          <w:rFonts w:hint="eastAsia"/>
+          <w:b/>
+          <w:bCs/>
+        </w:rPr>
+        <w:t xml:space="preserve">7.3 </w:t>
+      </w:r>
+      <w:r>
+        <w:rPr>
+          <w:rFonts w:hint="eastAsia"/>
+          <w:b/>
+          <w:bCs/>
+        </w:rPr>
+        <w:t>技术创新机制检验</w:t>
+      </w:r>
+    </w:p>
+    <w:p>
+      <w:pPr>
+        <w:ind w:firstLineChars="283" w:firstLine="682"/>
+        <w:rPr>
+          <w:b/>
+          <w:bCs/>
+        </w:rPr>
+      </w:pPr>
+      <w:r>
+        <w:rPr>
+          <w:rFonts w:hint="eastAsia"/>
+          <w:b/>
+          <w:bCs/>
+        </w:rPr>
+        <w:t xml:space="preserve">7.4 </w:t>
+      </w:r>
+      <w:r>
+        <w:rPr>
+          <w:rFonts w:hint="eastAsia"/>
+          <w:b/>
+          <w:bCs/>
+        </w:rPr>
+        <w:t>组织管理效率机制检验</w:t>
+      </w:r>
+    </w:p>
+    <w:p>
+      <w:pPr>
+        <w:ind w:firstLineChars="283" w:firstLine="682"/>
+        <w:rPr>
+          <w:b/>
+          <w:bCs/>
+        </w:rPr>
+      </w:pPr>
+      <w:r>
+        <w:rPr>
+          <w:rFonts w:hint="eastAsia"/>
+          <w:b/>
+          <w:bCs/>
+        </w:rPr>
+        <w:t xml:space="preserve">7.5 </w:t>
+      </w:r>
+      <w:r>
+        <w:rPr>
+          <w:rFonts w:hint="eastAsia"/>
+          <w:b/>
+          <w:bCs/>
+        </w:rPr>
+        <w:t>市场匹配与需求预测机制检验（如指标可得）</w:t>
+      </w:r>
+    </w:p>
+    <w:p>
+      <w:pPr>
+        <w:ind w:firstLineChars="283" w:firstLine="682"/>
+        <w:rPr>
+          <w:b/>
+          <w:bCs/>
+        </w:rPr>
+      </w:pPr>
+      <w:r>
+        <w:rPr>
+          <w:rFonts w:hint="eastAsia"/>
+          <w:b/>
+          <w:bCs/>
+        </w:rPr>
+        <w:t xml:space="preserve">7.6 </w:t>
+      </w:r>
+      <w:r>
+        <w:rPr>
+          <w:rFonts w:hint="eastAsia"/>
+          <w:b/>
+          <w:bCs/>
+        </w:rPr>
+        <w:t>机制检验结果小结</w:t>
+      </w:r>
+    </w:p>
+    <w:p>
+      <w:pPr>
+        <w:ind w:firstLineChars="83"/>
         <w:rPr>
           <w:b/>
           <w:bCs/>
@@ -2889,7 +3877,7 @@
           <w:b/>
           <w:bCs/>
         </w:rPr>
-        <w:t>6</w:t>
+        <w:t>8</w:t>
       </w:r>
       <w:r>
         <w:rPr>
@@ -2913,368 +3901,17 @@
           <w:b/>
           <w:bCs/>
         </w:rPr>
-        <w:t>异质性因果效应：基于因果森林的微观识别</w:t>
-      </w:r>
-    </w:p>
-    <w:p>
-      <w:pPr>
-        <w:ind w:firstLine="480"/>
-      </w:pPr>
-      <w:r>
-        <w:rPr>
-          <w:rFonts w:hint="eastAsia"/>
-        </w:rPr>
-        <w:t xml:space="preserve">6.1 </w:t>
-      </w:r>
-      <w:r>
-        <w:rPr>
-          <w:rFonts w:hint="eastAsia"/>
-        </w:rPr>
-        <w:t>因果森林模型原理</w:t>
-      </w:r>
-    </w:p>
-    <w:p>
-      <w:pPr>
-        <w:ind w:firstLineChars="400" w:firstLine="960"/>
-      </w:pPr>
-      <w:r>
-        <w:rPr>
-          <w:rFonts w:hint="eastAsia"/>
-        </w:rPr>
-        <w:t xml:space="preserve">6.1.1 </w:t>
-      </w:r>
-      <w:r>
-        <w:rPr>
-          <w:rFonts w:hint="eastAsia"/>
-        </w:rPr>
-        <w:t>条件平均处理效应（</w:t>
-      </w:r>
-      <w:r>
-        <w:rPr>
-          <w:rFonts w:hint="eastAsia"/>
-        </w:rPr>
-        <w:t>CATE</w:t>
-      </w:r>
-      <w:r>
-        <w:rPr>
-          <w:rFonts w:hint="eastAsia"/>
-        </w:rPr>
-        <w:t>）</w:t>
-      </w:r>
-    </w:p>
-    <w:p>
-      <w:pPr>
-        <w:ind w:firstLineChars="400" w:firstLine="960"/>
-      </w:pPr>
-      <w:r>
-        <w:rPr>
-          <w:rFonts w:hint="eastAsia"/>
-        </w:rPr>
-        <w:t>6.1.2 Honest splitting</w:t>
-      </w:r>
-      <w:r>
-        <w:rPr>
-          <w:rFonts w:hint="eastAsia"/>
-        </w:rPr>
-        <w:t>与交叉拟合</w:t>
-      </w:r>
-    </w:p>
-    <w:p>
-      <w:pPr>
-        <w:ind w:firstLineChars="400" w:firstLine="960"/>
-      </w:pPr>
-      <w:r>
-        <w:rPr>
-          <w:rFonts w:hint="eastAsia"/>
-        </w:rPr>
-        <w:t xml:space="preserve">6.1.3 </w:t>
-      </w:r>
-      <w:r>
-        <w:rPr>
-          <w:rFonts w:hint="eastAsia"/>
-        </w:rPr>
-        <w:t>变量重要性度量</w:t>
-      </w:r>
-    </w:p>
-    <w:p>
-      <w:pPr>
-        <w:ind w:firstLine="480"/>
-      </w:pPr>
-      <w:r>
-        <w:rPr>
-          <w:rFonts w:hint="eastAsia"/>
-        </w:rPr>
-        <w:t xml:space="preserve">6.2 </w:t>
-      </w:r>
-      <w:r>
-        <w:rPr>
-          <w:rFonts w:hint="eastAsia"/>
-        </w:rPr>
-        <w:t>模型设定与参数选择</w:t>
-      </w:r>
-    </w:p>
-    <w:p>
-      <w:pPr>
-        <w:ind w:firstLine="480"/>
-      </w:pPr>
-      <w:r>
-        <w:rPr>
-          <w:rFonts w:hint="eastAsia"/>
-        </w:rPr>
-        <w:t xml:space="preserve">6.3 </w:t>
-      </w:r>
-      <w:r>
-        <w:rPr>
-          <w:rFonts w:hint="eastAsia"/>
-        </w:rPr>
-        <w:t>个体处理效应估计结果</w:t>
-      </w:r>
-    </w:p>
-    <w:p>
-      <w:pPr>
-        <w:ind w:firstLineChars="400" w:firstLine="960"/>
-      </w:pPr>
-      <w:r>
-        <w:rPr>
-          <w:rFonts w:hint="eastAsia"/>
-        </w:rPr>
-        <w:t>效应分布</w:t>
-      </w:r>
-    </w:p>
-    <w:p>
-      <w:pPr>
-        <w:ind w:firstLineChars="400" w:firstLine="960"/>
-      </w:pPr>
-      <w:r>
-        <w:rPr>
-          <w:rFonts w:hint="eastAsia"/>
-        </w:rPr>
-        <w:t>分位数差异</w:t>
-      </w:r>
-    </w:p>
-    <w:p>
-      <w:pPr>
-        <w:ind w:firstLineChars="400" w:firstLine="960"/>
-      </w:pPr>
-      <w:r>
-        <w:rPr>
-          <w:rFonts w:hint="eastAsia"/>
-        </w:rPr>
-        <w:lastRenderedPageBreak/>
-        <w:t>极端企业识别</w:t>
-      </w:r>
-    </w:p>
-    <w:p>
-      <w:pPr>
-        <w:ind w:firstLine="480"/>
-      </w:pPr>
-      <w:r>
-        <w:rPr>
-          <w:rFonts w:hint="eastAsia"/>
-        </w:rPr>
-        <w:t xml:space="preserve">6.4 </w:t>
-      </w:r>
-      <w:r>
-        <w:rPr>
-          <w:rFonts w:hint="eastAsia"/>
-        </w:rPr>
-        <w:t>异质性影响特征分析</w:t>
-      </w:r>
-    </w:p>
-    <w:p>
-      <w:pPr>
-        <w:ind w:firstLineChars="400" w:firstLine="960"/>
-      </w:pPr>
-      <w:r>
-        <w:rPr>
-          <w:rFonts w:hint="eastAsia"/>
-        </w:rPr>
-        <w:t>不同规模企业</w:t>
-      </w:r>
-    </w:p>
-    <w:p>
-      <w:pPr>
-        <w:ind w:firstLineChars="400" w:firstLine="960"/>
-      </w:pPr>
-      <w:r>
-        <w:rPr>
-          <w:rFonts w:hint="eastAsia"/>
-        </w:rPr>
-        <w:t>不同生命周期</w:t>
-      </w:r>
-    </w:p>
-    <w:p>
-      <w:pPr>
-        <w:ind w:firstLineChars="400" w:firstLine="960"/>
-      </w:pPr>
-      <w:r>
-        <w:rPr>
-          <w:rFonts w:hint="eastAsia"/>
-        </w:rPr>
-        <w:t>不同行业</w:t>
-      </w:r>
-    </w:p>
-    <w:p>
-      <w:pPr>
-        <w:ind w:firstLineChars="400" w:firstLine="960"/>
-      </w:pPr>
-      <w:r>
-        <w:rPr>
-          <w:rFonts w:hint="eastAsia"/>
-        </w:rPr>
-        <w:t>不同区域</w:t>
-      </w:r>
-    </w:p>
-    <w:p>
-      <w:pPr>
-        <w:ind w:firstLineChars="83"/>
-        <w:rPr>
-          <w:b/>
-          <w:bCs/>
-        </w:rPr>
-      </w:pPr>
-      <w:r>
-        <w:rPr>
-          <w:rFonts w:hint="eastAsia"/>
-          <w:b/>
-          <w:bCs/>
-        </w:rPr>
-        <w:t>第</w:t>
-      </w:r>
-      <w:r>
-        <w:rPr>
-          <w:rFonts w:hint="eastAsia"/>
-          <w:b/>
-          <w:bCs/>
-        </w:rPr>
-        <w:t>7</w:t>
-      </w:r>
-      <w:r>
-        <w:rPr>
-          <w:rFonts w:hint="eastAsia"/>
-          <w:b/>
-          <w:bCs/>
-        </w:rPr>
-        <w:t>章</w:t>
-      </w:r>
-      <w:r>
-        <w:rPr>
-          <w:rFonts w:hint="eastAsia"/>
-          <w:b/>
-          <w:bCs/>
-        </w:rPr>
-        <w:t xml:space="preserve"> </w:t>
-      </w:r>
-      <w:r>
-        <w:rPr>
-          <w:rFonts w:hint="eastAsia"/>
-          <w:b/>
-          <w:bCs/>
-        </w:rPr>
-        <w:t>作用机制与传导路径检验</w:t>
-      </w:r>
-    </w:p>
-    <w:p>
-      <w:pPr>
-        <w:ind w:firstLineChars="283" w:firstLine="679"/>
-      </w:pPr>
-      <w:r>
-        <w:rPr>
-          <w:rFonts w:hint="eastAsia"/>
-        </w:rPr>
-        <w:t xml:space="preserve">7.1 </w:t>
-      </w:r>
-      <w:r>
-        <w:rPr>
-          <w:rFonts w:hint="eastAsia"/>
-        </w:rPr>
-        <w:t>中介效应模型设定</w:t>
-      </w:r>
-    </w:p>
-    <w:p>
-      <w:pPr>
-        <w:ind w:firstLineChars="283" w:firstLine="679"/>
-      </w:pPr>
-      <w:r>
-        <w:rPr>
-          <w:rFonts w:hint="eastAsia"/>
-        </w:rPr>
-        <w:t xml:space="preserve">7.2 </w:t>
-      </w:r>
-      <w:r>
-        <w:rPr>
-          <w:rFonts w:hint="eastAsia"/>
-        </w:rPr>
-        <w:t>技术创新机制检验</w:t>
-      </w:r>
-    </w:p>
-    <w:p>
-      <w:pPr>
-        <w:ind w:firstLineChars="283" w:firstLine="679"/>
-      </w:pPr>
-      <w:r>
-        <w:rPr>
-          <w:rFonts w:hint="eastAsia"/>
-        </w:rPr>
-        <w:t xml:space="preserve">7.3 </w:t>
-      </w:r>
-      <w:r>
-        <w:rPr>
-          <w:rFonts w:hint="eastAsia"/>
-        </w:rPr>
-        <w:t>资源配置效率机制检验</w:t>
-      </w:r>
-    </w:p>
-    <w:p>
-      <w:pPr>
-        <w:ind w:firstLineChars="283" w:firstLine="679"/>
-      </w:pPr>
-      <w:r>
-        <w:rPr>
-          <w:rFonts w:hint="eastAsia"/>
-        </w:rPr>
-        <w:t xml:space="preserve">7.4 </w:t>
-      </w:r>
-      <w:r>
-        <w:rPr>
-          <w:rFonts w:hint="eastAsia"/>
-        </w:rPr>
-        <w:t>融资约束缓解机制检验</w:t>
-      </w:r>
-    </w:p>
-    <w:p>
-      <w:pPr>
-        <w:ind w:firstLineChars="283" w:firstLine="679"/>
-      </w:pPr>
-      <w:r>
-        <w:rPr>
-          <w:rFonts w:hint="eastAsia"/>
-        </w:rPr>
-        <w:t xml:space="preserve">7.5 </w:t>
-      </w:r>
-      <w:r>
-        <w:rPr>
-          <w:rFonts w:hint="eastAsia"/>
-        </w:rPr>
-        <w:t>管理效率提升机制检验</w:t>
-      </w:r>
-    </w:p>
-    <w:p>
-      <w:pPr>
-        <w:ind w:firstLineChars="83"/>
-        <w:rPr>
-          <w:b/>
-          <w:bCs/>
-        </w:rPr>
-      </w:pPr>
-      <w:r>
-        <w:rPr>
-          <w:rFonts w:hint="eastAsia"/>
-          <w:b/>
-          <w:bCs/>
-        </w:rPr>
-        <w:t>第</w:t>
-      </w:r>
+        <w:t>结论与政策启示</w:t>
+      </w:r>
+    </w:p>
+    <w:p>
+      <w:pPr>
+        <w:ind w:firstLineChars="283" w:firstLine="682"/>
+        <w:rPr>
+          <w:b/>
+          <w:bCs/>
+        </w:rPr>
+      </w:pPr>
       <w:r>
         <w:rPr>
           <w:rFonts w:hint="eastAsia"/>
@@ -3289,123 +3926,130 @@
           <w:b/>
           <w:bCs/>
         </w:rPr>
-        <w:t>章</w:t>
-      </w:r>
-      <w:r>
-        <w:rPr>
-          <w:rFonts w:hint="eastAsia"/>
-          <w:b/>
-          <w:bCs/>
-        </w:rPr>
-        <w:t xml:space="preserve"> </w:t>
-      </w:r>
-      <w:r>
-        <w:rPr>
-          <w:rFonts w:hint="eastAsia"/>
-          <w:b/>
-          <w:bCs/>
-        </w:rPr>
-        <w:t>结论与政策启示</w:t>
-      </w:r>
-    </w:p>
-    <w:p>
-      <w:pPr>
-        <w:ind w:firstLineChars="283" w:firstLine="679"/>
-      </w:pPr>
-      <w:r>
-        <w:rPr>
-          <w:rFonts w:hint="eastAsia"/>
+        <w:t xml:space="preserve">.1 </w:t>
+      </w:r>
+      <w:r>
+        <w:rPr>
+          <w:rFonts w:hint="eastAsia"/>
+          <w:b/>
+          <w:bCs/>
+        </w:rPr>
+        <w:t>研究结论</w:t>
+      </w:r>
+    </w:p>
+    <w:p>
+      <w:pPr>
+        <w:ind w:firstLineChars="283" w:firstLine="682"/>
+        <w:rPr>
+          <w:b/>
+          <w:bCs/>
+        </w:rPr>
+      </w:pPr>
+      <w:r>
+        <w:rPr>
+          <w:rFonts w:hint="eastAsia"/>
+          <w:b/>
+          <w:bCs/>
         </w:rPr>
         <w:t>8</w:t>
       </w:r>
       <w:r>
         <w:rPr>
           <w:rFonts w:hint="eastAsia"/>
-        </w:rPr>
-        <w:t xml:space="preserve">.1 </w:t>
-      </w:r>
-      <w:r>
-        <w:rPr>
-          <w:rFonts w:hint="eastAsia"/>
-        </w:rPr>
-        <w:t>研究结论</w:t>
-      </w:r>
-    </w:p>
-    <w:p>
-      <w:pPr>
-        <w:ind w:firstLineChars="283" w:firstLine="679"/>
-      </w:pPr>
-      <w:r>
-        <w:rPr>
-          <w:rFonts w:hint="eastAsia"/>
+          <w:b/>
+          <w:bCs/>
+        </w:rPr>
+        <w:t xml:space="preserve">.2 </w:t>
+      </w:r>
+      <w:r>
+        <w:rPr>
+          <w:rFonts w:hint="eastAsia"/>
+          <w:b/>
+          <w:bCs/>
+        </w:rPr>
+        <w:t>政策建议</w:t>
+      </w:r>
+    </w:p>
+    <w:p>
+      <w:pPr>
+        <w:ind w:left="581" w:firstLineChars="283" w:firstLine="679"/>
+      </w:pPr>
+      <w:r>
+        <w:rPr>
+          <w:rFonts w:hint="eastAsia"/>
+        </w:rPr>
+        <w:t xml:space="preserve">8.2.1 </w:t>
+      </w:r>
+      <w:r>
+        <w:rPr>
+          <w:rFonts w:hint="eastAsia"/>
+        </w:rPr>
+        <w:t>政府层面：推进差异化数字赋能政策</w:t>
+      </w:r>
+    </w:p>
+    <w:p>
+      <w:pPr>
+        <w:ind w:left="581" w:firstLineChars="283" w:firstLine="679"/>
+      </w:pPr>
+      <w:r>
+        <w:rPr>
+          <w:rFonts w:hint="eastAsia"/>
+        </w:rPr>
+        <w:t xml:space="preserve">8.2.2 </w:t>
+      </w:r>
+      <w:r>
+        <w:rPr>
+          <w:rFonts w:hint="eastAsia"/>
+        </w:rPr>
+        <w:t>企业层面：从技术投入转向能力建设</w:t>
+      </w:r>
+    </w:p>
+    <w:p>
+      <w:pPr>
+        <w:ind w:left="581" w:firstLineChars="283" w:firstLine="679"/>
+      </w:pPr>
+      <w:r>
+        <w:rPr>
+          <w:rFonts w:hint="eastAsia"/>
+        </w:rPr>
+        <w:t xml:space="preserve">8.2.3 </w:t>
+      </w:r>
+      <w:r>
+        <w:rPr>
+          <w:rFonts w:hint="eastAsia"/>
+        </w:rPr>
+        <w:t>市场层面：完善数据要素市场配置机制</w:t>
+      </w:r>
+    </w:p>
+    <w:p>
+      <w:pPr>
+        <w:ind w:firstLineChars="283" w:firstLine="682"/>
+        <w:rPr>
+          <w:b/>
+          <w:bCs/>
+        </w:rPr>
+      </w:pPr>
+      <w:r>
+        <w:rPr>
+          <w:rFonts w:hint="eastAsia"/>
+          <w:b/>
+          <w:bCs/>
         </w:rPr>
         <w:t>8</w:t>
       </w:r>
       <w:r>
         <w:rPr>
           <w:rFonts w:hint="eastAsia"/>
-        </w:rPr>
-        <w:t xml:space="preserve">.2 </w:t>
-      </w:r>
-      <w:r>
-        <w:rPr>
-          <w:rFonts w:hint="eastAsia"/>
-        </w:rPr>
-        <w:t>政策建议</w:t>
-      </w:r>
-    </w:p>
-    <w:p>
-      <w:pPr>
-        <w:ind w:firstLineChars="483" w:firstLine="1159"/>
-      </w:pPr>
-      <w:r>
-        <w:rPr>
-          <w:rFonts w:hint="eastAsia"/>
-        </w:rPr>
-        <w:t>政府层面</w:t>
-      </w:r>
-    </w:p>
-    <w:p>
-      <w:pPr>
-        <w:ind w:firstLineChars="483" w:firstLine="1159"/>
-      </w:pPr>
-      <w:r>
-        <w:rPr>
-          <w:rFonts w:hint="eastAsia"/>
-        </w:rPr>
-        <w:t>企业层面</w:t>
-      </w:r>
-    </w:p>
-    <w:p>
-      <w:pPr>
-        <w:ind w:firstLineChars="483" w:firstLine="1159"/>
-      </w:pPr>
-      <w:r>
-        <w:rPr>
-          <w:rFonts w:hint="eastAsia"/>
-        </w:rPr>
-        <w:t>数据市场建设</w:t>
-      </w:r>
-    </w:p>
-    <w:p>
-      <w:pPr>
-        <w:ind w:firstLineChars="283" w:firstLine="679"/>
-      </w:pPr>
-      <w:r>
-        <w:rPr>
-          <w:rFonts w:hint="eastAsia"/>
-        </w:rPr>
-        <w:t>8</w:t>
-      </w:r>
-      <w:r>
-        <w:rPr>
-          <w:rFonts w:hint="eastAsia"/>
+          <w:b/>
+          <w:bCs/>
         </w:rPr>
         <w:t xml:space="preserve">.3 </w:t>
       </w:r>
       <w:r>
         <w:rPr>
           <w:rFonts w:hint="eastAsia"/>
+          <w:b/>
+          <w:bCs/>
         </w:rPr>
         <w:t>研究不足与未来展望</w:t>
       </w:r>
@@ -3538,7 +4182,13 @@
         <w:rPr>
           <w:rFonts w:hint="eastAsia"/>
         </w:rPr>
-        <w:t>2010</w:t>
+        <w:t>20</w:t>
+      </w:r>
+      <w:r>
+        <w:rPr>
+          <w:rFonts w:hint="eastAsia"/>
+        </w:rPr>
+        <w:t>20</w:t>
       </w:r>
       <w:r>
         <w:rPr>
@@ -3550,7 +4200,13 @@
         <w:rPr>
           <w:rFonts w:hint="eastAsia"/>
         </w:rPr>
-        <w:t>2022</w:t>
+        <w:t>202</w:t>
+      </w:r>
+      <w:r>
+        <w:rPr>
+          <w:rFonts w:hint="eastAsia"/>
+        </w:rPr>
+        <w:t>5</w:t>
       </w:r>
       <w:r>
         <w:rPr>
@@ -5884,9 +6540,6 @@
     <w:p>
       <w:pPr>
         <w:ind w:firstLine="480"/>
-        <w:rPr>
-          <w:rFonts w:hint="eastAsia"/>
-        </w:rPr>
       </w:pPr>
       <w:r>
         <w:rPr>
@@ -6093,19 +6746,16 @@
             <v:path o:extrusionok="f" gradientshapeok="t" o:connecttype="rect"/>
             <o:lock v:ext="edit" aspectratio="t"/>
           </v:shapetype>
-          <v:shape id="_x0000_i1035" type="#_x0000_t75" style="width:99pt;height:19pt" o:ole="">
+          <v:shape id="_x0000_i1025" type="#_x0000_t75" style="width:98.9pt;height:19.15pt" o:ole="">
             <v:imagedata r:id="rId22" o:title=""/>
           </v:shape>
-          <o:OLEObject Type="Embed" ProgID="Equation.DSMT4" ShapeID="_x0000_i1035" DrawAspect="Content" ObjectID="_1833352648" r:id="rId23"/>
+          <o:OLEObject Type="Embed" ProgID="Equation.DSMT4" ShapeID="_x0000_i1025" DrawAspect="Content" ObjectID="_1833522066" r:id="rId23"/>
         </w:object>
       </w:r>
     </w:p>
     <w:p>
       <w:pPr>
         <w:ind w:firstLineChars="0" w:firstLine="0"/>
-        <w:rPr>
-          <w:rFonts w:hint="eastAsia"/>
-        </w:rPr>
       </w:pPr>
       <w:r>
         <w:rPr>
@@ -6119,10 +6769,10 @@
           <w:position w:val="-12"/>
         </w:rPr>
         <w:object w:dxaOrig="260" w:dyaOrig="360" w14:anchorId="52646DD5">
-          <v:shape id="_x0000_i1036" type="#_x0000_t75" style="width:13pt;height:18pt" o:ole="">
+          <v:shape id="_x0000_i1026" type="#_x0000_t75" style="width:13.2pt;height:18.25pt" o:ole="">
             <v:imagedata r:id="rId24" o:title=""/>
           </v:shape>
-          <o:OLEObject Type="Embed" ProgID="Equation.DSMT4" ShapeID="_x0000_i1036" DrawAspect="Content" ObjectID="_1833352649" r:id="rId25"/>
+          <o:OLEObject Type="Embed" ProgID="Equation.DSMT4" ShapeID="_x0000_i1026" DrawAspect="Content" ObjectID="_1833522067" r:id="rId25"/>
         </w:object>
       </w:r>
       <w:r>
@@ -6140,10 +6790,10 @@
           <w:position w:val="-12"/>
         </w:rPr>
         <w:object w:dxaOrig="300" w:dyaOrig="360" w14:anchorId="3F9D1086">
-          <v:shape id="_x0000_i1039" type="#_x0000_t75" style="width:15pt;height:18pt" o:ole="">
+          <v:shape id="_x0000_i1027" type="#_x0000_t75" style="width:15.05pt;height:18.25pt" o:ole="">
             <v:imagedata r:id="rId26" o:title=""/>
           </v:shape>
-          <o:OLEObject Type="Embed" ProgID="Equation.DSMT4" ShapeID="_x0000_i1039" DrawAspect="Content" ObjectID="_1833352650" r:id="rId27"/>
+          <o:OLEObject Type="Embed" ProgID="Equation.DSMT4" ShapeID="_x0000_i1027" DrawAspect="Content" ObjectID="_1833522068" r:id="rId27"/>
         </w:object>
       </w:r>
       <w:r>
@@ -6155,10 +6805,10 @@
           <w:position w:val="-12"/>
         </w:rPr>
         <w:object w:dxaOrig="340" w:dyaOrig="360" w14:anchorId="0D0CF41A">
-          <v:shape id="_x0000_i1042" type="#_x0000_t75" style="width:17pt;height:18pt" o:ole="">
+          <v:shape id="_x0000_i1028" type="#_x0000_t75" style="width:16.85pt;height:18.25pt" o:ole="">
             <v:imagedata r:id="rId28" o:title=""/>
           </v:shape>
-          <o:OLEObject Type="Embed" ProgID="Equation.DSMT4" ShapeID="_x0000_i1042" DrawAspect="Content" ObjectID="_1833352651" r:id="rId29"/>
+          <o:OLEObject Type="Embed" ProgID="Equation.DSMT4" ShapeID="_x0000_i1028" DrawAspect="Content" ObjectID="_1833522069" r:id="rId29"/>
         </w:object>
       </w:r>
       <w:r>
@@ -6176,10 +6826,10 @@
           <w:position w:val="-10"/>
         </w:rPr>
         <w:object w:dxaOrig="560" w:dyaOrig="320" w14:anchorId="481EF672">
-          <v:shape id="_x0000_i1043" type="#_x0000_t75" style="width:28pt;height:16pt" o:ole="">
+          <v:shape id="_x0000_i1029" type="#_x0000_t75" style="width:27.8pt;height:15.95pt" o:ole="">
             <v:imagedata r:id="rId30" o:title=""/>
           </v:shape>
-          <o:OLEObject Type="Embed" ProgID="Equation.DSMT4" ShapeID="_x0000_i1043" DrawAspect="Content" ObjectID="_1833352652" r:id="rId31"/>
+          <o:OLEObject Type="Embed" ProgID="Equation.DSMT4" ShapeID="_x0000_i1029" DrawAspect="Content" ObjectID="_1833522070" r:id="rId31"/>
         </w:object>
       </w:r>
       <w:r>
@@ -6203,10 +6853,10 @@
           <w:position w:val="-12"/>
         </w:rPr>
         <w:object w:dxaOrig="300" w:dyaOrig="360" w14:anchorId="370DE0A7">
-          <v:shape id="_x0000_i1044" type="#_x0000_t75" style="width:15pt;height:18pt" o:ole="">
+          <v:shape id="_x0000_i1030" type="#_x0000_t75" style="width:15.05pt;height:18.25pt" o:ole="">
             <v:imagedata r:id="rId26" o:title=""/>
           </v:shape>
-          <o:OLEObject Type="Embed" ProgID="Equation.DSMT4" ShapeID="_x0000_i1044" DrawAspect="Content" ObjectID="_1833352653" r:id="rId32"/>
+          <o:OLEObject Type="Embed" ProgID="Equation.DSMT4" ShapeID="_x0000_i1030" DrawAspect="Content" ObjectID="_1833522071" r:id="rId32"/>
         </w:object>
       </w:r>
       <w:r>
@@ -6472,10 +7122,10 @@
           <w:position w:val="-10"/>
         </w:rPr>
         <w:object w:dxaOrig="3840" w:dyaOrig="320" w14:anchorId="354B2CBD">
-          <v:shape id="_x0000_i1027" type="#_x0000_t75" style="width:192pt;height:16pt" o:ole="">
+          <v:shape id="_x0000_i1031" type="#_x0000_t75" style="width:191.85pt;height:15.95pt" o:ole="">
             <v:imagedata r:id="rId33" o:title=""/>
           </v:shape>
-          <o:OLEObject Type="Embed" ProgID="Equation.DSMT4" ShapeID="_x0000_i1027" DrawAspect="Content" ObjectID="_1833352654" r:id="rId34"/>
+          <o:OLEObject Type="Embed" ProgID="Equation.DSMT4" ShapeID="_x0000_i1031" DrawAspect="Content" ObjectID="_1833522072" r:id="rId34"/>
         </w:object>
       </w:r>
     </w:p>
@@ -6501,10 +7151,10 @@
           <w:position w:val="-10"/>
         </w:rPr>
         <w:object w:dxaOrig="4340" w:dyaOrig="320" w14:anchorId="7D8156E8">
-          <v:shape id="_x0000_i1028" type="#_x0000_t75" style="width:217pt;height:16pt" o:ole="">
+          <v:shape id="_x0000_i1032" type="#_x0000_t75" style="width:216.9pt;height:15.95pt" o:ole="">
             <v:imagedata r:id="rId35" o:title=""/>
           </v:shape>
-          <o:OLEObject Type="Embed" ProgID="Equation.DSMT4" ShapeID="_x0000_i1028" DrawAspect="Content" ObjectID="_1833352655" r:id="rId36"/>
+          <o:OLEObject Type="Embed" ProgID="Equation.DSMT4" ShapeID="_x0000_i1032" DrawAspect="Content" ObjectID="_1833522073" r:id="rId36"/>
         </w:object>
       </w:r>
     </w:p>
@@ -6622,10 +7272,10 @@
           <w:position w:val="-10"/>
         </w:rPr>
         <w:object w:dxaOrig="3940" w:dyaOrig="360" w14:anchorId="7B313CA2">
-          <v:shape id="_x0000_i1029" type="#_x0000_t75" style="width:197pt;height:18pt" o:ole="">
+          <v:shape id="_x0000_i1033" type="#_x0000_t75" style="width:196.85pt;height:18.25pt" o:ole="">
             <v:imagedata r:id="rId37" o:title=""/>
           </v:shape>
-          <o:OLEObject Type="Embed" ProgID="Equation.DSMT4" ShapeID="_x0000_i1029" DrawAspect="Content" ObjectID="_1833352656" r:id="rId38"/>
+          <o:OLEObject Type="Embed" ProgID="Equation.DSMT4" ShapeID="_x0000_i1033" DrawAspect="Content" ObjectID="_1833522074" r:id="rId38"/>
         </w:object>
       </w:r>
     </w:p>
@@ -6707,10 +7357,10 @@
           <w:position w:val="-14"/>
         </w:rPr>
         <w:object w:dxaOrig="2100" w:dyaOrig="380" w14:anchorId="5450B026">
-          <v:shape id="_x0000_i1030" type="#_x0000_t75" style="width:105pt;height:19pt" o:ole="">
+          <v:shape id="_x0000_i1034" type="#_x0000_t75" style="width:104.8pt;height:19.15pt" o:ole="">
             <v:imagedata r:id="rId39" o:title=""/>
           </v:shape>
-          <o:OLEObject Type="Embed" ProgID="Equation.DSMT4" ShapeID="_x0000_i1030" DrawAspect="Content" ObjectID="_1833352657" r:id="rId40"/>
+          <o:OLEObject Type="Embed" ProgID="Equation.DSMT4" ShapeID="_x0000_i1034" DrawAspect="Content" ObjectID="_1833522075" r:id="rId40"/>
         </w:object>
       </w:r>
     </w:p>
@@ -6792,10 +7442,10 @@
           <w:position w:val="-10"/>
         </w:rPr>
         <w:object w:dxaOrig="3560" w:dyaOrig="320" w14:anchorId="571AAC94">
-          <v:shape id="_x0000_i1031" type="#_x0000_t75" style="width:178pt;height:16pt" o:ole="">
+          <v:shape id="_x0000_i1035" type="#_x0000_t75" style="width:178.2pt;height:15.95pt" o:ole="">
             <v:imagedata r:id="rId41" o:title=""/>
           </v:shape>
-          <o:OLEObject Type="Embed" ProgID="Equation.DSMT4" ShapeID="_x0000_i1031" DrawAspect="Content" ObjectID="_1833352658" r:id="rId42"/>
+          <o:OLEObject Type="Embed" ProgID="Equation.DSMT4" ShapeID="_x0000_i1035" DrawAspect="Content" ObjectID="_1833522076" r:id="rId42"/>
         </w:object>
       </w:r>
     </w:p>
@@ -6970,9 +7620,6 @@
     <w:p>
       <w:pPr>
         <w:ind w:firstLine="480"/>
-        <w:rPr>
-          <w:rFonts w:hint="eastAsia"/>
-        </w:rPr>
       </w:pPr>
       <w:r>
         <w:rPr>
@@ -6984,9 +7631,6 @@
     <w:p>
       <w:pPr>
         <w:ind w:firstLineChars="0" w:firstLine="0"/>
-        <w:rPr>
-          <w:rFonts w:hint="eastAsia"/>
-        </w:rPr>
       </w:pPr>
       <w:r>
         <w:rPr>
@@ -7034,9 +7678,6 @@
     <w:p>
       <w:pPr>
         <w:ind w:firstLineChars="0" w:firstLine="0"/>
-        <w:rPr>
-          <w:rFonts w:hint="eastAsia"/>
-        </w:rPr>
       </w:pPr>
       <w:r>
         <w:rPr>
@@ -7137,7 +7778,22 @@
         <w:t xml:space="preserve">3.5 </w:t>
       </w:r>
       <w:r>
-        <w:t>双重机器学习</w:t>
+        <w:rPr>
+          <w:rFonts w:hint="eastAsia"/>
+        </w:rPr>
+        <w:t>双重机器学习（</w:t>
+      </w:r>
+      <w:r>
+        <w:rPr>
+          <w:rFonts w:hint="eastAsia"/>
+        </w:rPr>
+        <w:t>DML</w:t>
+      </w:r>
+      <w:r>
+        <w:rPr>
+          <w:rFonts w:hint="eastAsia"/>
+        </w:rPr>
+        <w:t>）与平均效应识别的理论衔接</w:t>
       </w:r>
     </w:p>
     <w:p>
@@ -7300,10 +7956,10 @@
           <w:position w:val="-10"/>
         </w:rPr>
         <w:object w:dxaOrig="859" w:dyaOrig="320" w14:anchorId="7CC953C9">
-          <v:shape id="_x0000_i1047" type="#_x0000_t75" style="width:43pt;height:16pt" o:ole="">
+          <v:shape id="_x0000_i1036" type="#_x0000_t75" style="width:42.85pt;height:15.95pt" o:ole="">
             <v:imagedata r:id="rId43" o:title=""/>
           </v:shape>
-          <o:OLEObject Type="Embed" ProgID="Equation.DSMT4" ShapeID="_x0000_i1047" DrawAspect="Content" ObjectID="_1833352659" r:id="rId44"/>
+          <o:OLEObject Type="Embed" ProgID="Equation.DSMT4" ShapeID="_x0000_i1036" DrawAspect="Content" ObjectID="_1833522077" r:id="rId44"/>
         </w:object>
       </w:r>
       <w:r>
@@ -7318,10 +7974,10 @@
           <w:position w:val="-10"/>
         </w:rPr>
         <w:object w:dxaOrig="859" w:dyaOrig="320" w14:anchorId="129073C1">
-          <v:shape id="_x0000_i1048" type="#_x0000_t75" style="width:43pt;height:16pt" o:ole="">
+          <v:shape id="_x0000_i1037" type="#_x0000_t75" style="width:42.85pt;height:15.95pt" o:ole="">
             <v:imagedata r:id="rId45" o:title=""/>
           </v:shape>
-          <o:OLEObject Type="Embed" ProgID="Equation.DSMT4" ShapeID="_x0000_i1048" DrawAspect="Content" ObjectID="_1833352660" r:id="rId46"/>
+          <o:OLEObject Type="Embed" ProgID="Equation.DSMT4" ShapeID="_x0000_i1037" DrawAspect="Content" ObjectID="_1833522078" r:id="rId46"/>
         </w:object>
       </w:r>
     </w:p>
@@ -7344,10 +8000,10 @@
           <w:position w:val="-10"/>
         </w:rPr>
         <w:object w:dxaOrig="3460" w:dyaOrig="400" w14:anchorId="4639156B">
-          <v:shape id="_x0000_i1049" type="#_x0000_t75" style="width:173pt;height:20pt" o:ole="">
+          <v:shape id="_x0000_i1038" type="#_x0000_t75" style="width:173.15pt;height:20.05pt" o:ole="">
             <v:imagedata r:id="rId47" o:title=""/>
           </v:shape>
-          <o:OLEObject Type="Embed" ProgID="Equation.DSMT4" ShapeID="_x0000_i1049" DrawAspect="Content" ObjectID="_1833352661" r:id="rId48"/>
+          <o:OLEObject Type="Embed" ProgID="Equation.DSMT4" ShapeID="_x0000_i1038" DrawAspect="Content" ObjectID="_1833522079" r:id="rId48"/>
         </w:object>
       </w:r>
     </w:p>
@@ -7842,7 +8498,10 @@
         <w:t xml:space="preserve"> </w:t>
       </w:r>
       <w:r>
-        <w:t>因果森林分析框架</w:t>
+        <w:rPr>
+          <w:rFonts w:hint="eastAsia"/>
+        </w:rPr>
+        <w:t>因果森林与异质性效应识别框架</w:t>
       </w:r>
     </w:p>
     <w:p>
@@ -7864,10 +8523,10 @@
           <w:position w:val="-12"/>
         </w:rPr>
         <w:object w:dxaOrig="2820" w:dyaOrig="360" w14:anchorId="16BB0284">
-          <v:shape id="_x0000_i1032" type="#_x0000_t75" style="width:141pt;height:18pt" o:ole="">
+          <v:shape id="_x0000_i1039" type="#_x0000_t75" style="width:140.8pt;height:18.25pt" o:ole="">
             <v:imagedata r:id="rId49" o:title=""/>
           </v:shape>
-          <o:OLEObject Type="Embed" ProgID="Equation.DSMT4" ShapeID="_x0000_i1032" DrawAspect="Content" ObjectID="_1833352662" r:id="rId50"/>
+          <o:OLEObject Type="Embed" ProgID="Equation.DSMT4" ShapeID="_x0000_i1039" DrawAspect="Content" ObjectID="_1833522080" r:id="rId50"/>
         </w:object>
       </w:r>
     </w:p>
@@ -7887,10 +8546,10 @@
           <w:position w:val="-10"/>
         </w:rPr>
         <w:object w:dxaOrig="240" w:dyaOrig="320" w14:anchorId="156AE0B1">
-          <v:shape id="_x0000_i1033" type="#_x0000_t75" style="width:12pt;height:16pt" o:ole="">
+          <v:shape id="_x0000_i1040" type="#_x0000_t75" style="width:11.85pt;height:15.95pt" o:ole="">
             <v:imagedata r:id="rId51" o:title=""/>
           </v:shape>
-          <o:OLEObject Type="Embed" ProgID="Equation.DSMT4" ShapeID="_x0000_i1033" DrawAspect="Content" ObjectID="_1833352663" r:id="rId52"/>
+          <o:OLEObject Type="Embed" ProgID="Equation.DSMT4" ShapeID="_x0000_i1040" DrawAspect="Content" ObjectID="_1833522081" r:id="rId52"/>
         </w:object>
       </w:r>
       <w:r>
@@ -7917,10 +8576,10 @@
           <w:position w:val="-12"/>
         </w:rPr>
         <w:object w:dxaOrig="3180" w:dyaOrig="360" w14:anchorId="1ADB4A2A">
-          <v:shape id="_x0000_i1034" type="#_x0000_t75" style="width:159pt;height:18pt" o:ole="">
+          <v:shape id="_x0000_i1041" type="#_x0000_t75" style="width:159.05pt;height:18.25pt" o:ole="">
             <v:imagedata r:id="rId53" o:title=""/>
           </v:shape>
-          <o:OLEObject Type="Embed" ProgID="Equation.DSMT4" ShapeID="_x0000_i1034" DrawAspect="Content" ObjectID="_1833352664" r:id="rId54"/>
+          <o:OLEObject Type="Embed" ProgID="Equation.DSMT4" ShapeID="_x0000_i1041" DrawAspect="Content" ObjectID="_1833522082" r:id="rId54"/>
         </w:object>
       </w:r>
     </w:p>
@@ -7935,9 +8594,6 @@
     <w:p>
       <w:pPr>
         <w:ind w:firstLine="480"/>
-        <w:rPr>
-          <w:rFonts w:hint="eastAsia"/>
-        </w:rPr>
       </w:pPr>
       <w:r>
         <w:rPr>
@@ -10104,6 +10760,7 @@
   <w:style w:type="character" w:default="1" w:styleId="a1">
     <w:name w:val="Default Paragraph Font"/>
     <w:uiPriority w:val="1"/>
+    <w:semiHidden/>
     <w:unhideWhenUsed/>
   </w:style>
   <w:style w:type="table" w:default="1" w:styleId="a2">
@@ -10135,13 +10792,13 @@
     <w:uiPriority w:val="39"/>
     <w:unhideWhenUsed/>
     <w:qFormat/>
-    <w:rsid w:val="0067625B"/>
+    <w:rsid w:val="00C8099D"/>
     <w:pPr>
       <w:tabs>
         <w:tab w:val="right" w:leader="dot" w:pos="8296"/>
       </w:tabs>
       <w:spacing w:line="400" w:lineRule="exact"/>
-      <w:ind w:firstLineChars="0" w:firstLine="0"/>
+      <w:ind w:firstLine="482"/>
     </w:pPr>
     <w:rPr>
       <w:rFonts w:cs="Times New Roman"/>

</xml_diff>